<commit_message>
Sprint 3 & 4: secure implementation, evidence, final report v5, presentation
</commit_message>
<xml_diff>
--- a/docs/PRP_Research_Report_Token_Session_Handling_v2.docx
+++ b/docs/PRP_Research_Report_Token_Session_Handling_v2.docx
@@ -652,6 +652,32 @@
                 <w:szCs w:val="20"/>
               </w:rPr>
             </w:pPr>
+            <w:hyperlink r:id="rId8" w:history="1">
+              <w:r>
+                <w:rPr>
+                  <w:rStyle w:val="Hyperlink"/>
+                  <w:sz w:val="20"/>
+                  <w:szCs w:val="20"/>
+                </w:rPr>
+                <w:t>https://github.com/Sertyg-a11/prp-toke</w:t>
+              </w:r>
+              <w:r>
+                <w:rPr>
+                  <w:rStyle w:val="Hyperlink"/>
+                  <w:sz w:val="20"/>
+                  <w:szCs w:val="20"/>
+                </w:rPr>
+                <w:t>n</w:t>
+              </w:r>
+              <w:r>
+                <w:rPr>
+                  <w:rStyle w:val="Hyperlink"/>
+                  <w:sz w:val="20"/>
+                  <w:szCs w:val="20"/>
+                </w:rPr>
+                <w:t>-session.git</w:t>
+              </w:r>
+            </w:hyperlink>
           </w:p>
         </w:tc>
       </w:tr>
@@ -3650,7 +3676,21 @@
                 <w:rStyle w:val="Hyperlink"/>
                 <w:noProof/>
               </w:rPr>
-              <w:t>4.9 Test approach and evidence collection</w:t>
+              <w:t>4.9 Test approach and eviden</w:t>
+            </w:r>
+            <w:r>
+              <w:rPr>
+                <w:rStyle w:val="Hyperlink"/>
+                <w:noProof/>
+              </w:rPr>
+              <w:t>c</w:t>
+            </w:r>
+            <w:r>
+              <w:rPr>
+                <w:rStyle w:val="Hyperlink"/>
+                <w:noProof/>
+              </w:rPr>
+              <w:t>e collection</w:t>
             </w:r>
             <w:r>
               <w:rPr>
@@ -13254,7 +13294,30 @@
       </w:pPr>
       <w:r>
         <w:lastRenderedPageBreak/>
-        <w:t>Each scenario follows the same evidence template so the resulting comparison in Sprint 3 is consistent: a short prerequisites checklist, the exact reproduction steps, the artefacts captured (screenshots, headers, pcap excerpts, log lines), and the observation expressed in plain language. Evidence is stored under evidence/SX/ in the repository and referenced from the report.</w:t>
+        <w:t xml:space="preserve">Each scenario follows the same evidence template so the resulting comparison in Sprint 3 is consistent: a short prerequisites checklist, the exact reproduction steps, the artefacts captured (screenshots, headers, pcap excerpts, log lines), and the observation expressed in plain language. Evidence is stored under evidence/SX/ in the </w:t>
+      </w:r>
+      <w:hyperlink r:id="rId9" w:history="1">
+        <w:r>
+          <w:rPr>
+            <w:rStyle w:val="Hyperlink"/>
+          </w:rPr>
+          <w:t>reposi</w:t>
+        </w:r>
+        <w:r>
+          <w:rPr>
+            <w:rStyle w:val="Hyperlink"/>
+          </w:rPr>
+          <w:t>t</w:t>
+        </w:r>
+        <w:r>
+          <w:rPr>
+            <w:rStyle w:val="Hyperlink"/>
+          </w:rPr>
+          <w:t>ory</w:t>
+        </w:r>
+      </w:hyperlink>
+      <w:r>
+        <w:t xml:space="preserve"> and referenced from the report.</w:t>
       </w:r>
     </w:p>
     <w:tbl>
@@ -14619,8 +14682,8 @@
       </w:r>
     </w:p>
     <w:sectPr>
-      <w:headerReference w:type="default" r:id="rId8"/>
-      <w:footerReference w:type="default" r:id="rId9"/>
+      <w:headerReference w:type="default" r:id="rId10"/>
+      <w:footerReference w:type="default" r:id="rId11"/>
       <w:pgSz w:w="12240" w:h="15840"/>
       <w:pgMar w:top="1440" w:right="1440" w:bottom="1440" w:left="1440" w:header="708" w:footer="708" w:gutter="0"/>
       <w:cols w:space="720"/>
@@ -15876,6 +15939,30 @@
       <w:ind w:left="440"/>
     </w:pPr>
   </w:style>
+  <w:style w:type="character" w:styleId="UnresolvedMention">
+    <w:name w:val="Unresolved Mention"/>
+    <w:basedOn w:val="DefaultParagraphFont"/>
+    <w:uiPriority w:val="99"/>
+    <w:semiHidden/>
+    <w:unhideWhenUsed/>
+    <w:rsid w:val="00FD4391"/>
+    <w:rPr>
+      <w:color w:val="605E5C"/>
+      <w:shd w:val="clear" w:color="auto" w:fill="E1DFDD"/>
+    </w:rPr>
+  </w:style>
+  <w:style w:type="character" w:styleId="FollowedHyperlink">
+    <w:name w:val="FollowedHyperlink"/>
+    <w:basedOn w:val="DefaultParagraphFont"/>
+    <w:uiPriority w:val="99"/>
+    <w:semiHidden/>
+    <w:unhideWhenUsed/>
+    <w:rsid w:val="00FD4391"/>
+    <w:rPr>
+      <w:color w:val="96607D" w:themeColor="followedHyperlink"/>
+      <w:u w:val="single"/>
+    </w:rPr>
+  </w:style>
 </w:styles>
 </file>
 

</xml_diff>